<commit_message>
docs(qa): verify SPEC 008 runtime and QA-DEMO-V1 UAT readiness - UAT https://avicola.globaldv.net sirve 68d78fc (UAT_SHA_MATCH PASS: bundle, locales y contrato de API con farm_name/lot_code/registered_by_name/business_unit_code) ; checklist 3.1-3.8 PASS por sonda Playwright (3.7 solo lectura por permisos), BR-14 y maquina de estados PASS por API, bucle de revision NOT_PRESENT (1 GET en 60 s) ; E2E afectados 64/64 + spec SPEC 008 8/8 ; QA-DEMO-V1 BLOCKED_EXTERNAL (ConnectionReset SSL desde la estacion; runbook vigente), smokes Reproductoras/Incubadora bloqueados por dataset y usuarios ; plan QA con estado del ambiente y mensaje SAP sintetico ; FINAL_STATUS LOCALLY_CERTIFIED_RUNTIME_BLOCKED_EXTERNAL ; sin rama nueva, 0 llamadas SAP
Co-Authored-By: Claude Fable 5.1 <noreply@anthropic.com>
</commit_message>
<xml_diff>
--- a/docs/PLAN_QA_REPRODUCTORAS_INCUBADORA.docx
+++ b/docs/PLAN_QA_REPRODUCTORAS_INCUBADORA.docx
@@ -83,6 +83,136 @@
           <w:i w:val="0"/>
         </w:rPr>
         <w:t xml:space="preserve"> (máquina de estados del evento operativo).</w:t>
+      </w:r>
+    </w:p>
+    <w:p/>
+    <w:p>
+      <w:pPr>
+        <w:pStyle w:val="Heading2"/>
+      </w:pPr>
+      <w:r>
+        <w:t>0 · Estado del ambiente para esta ronda</w:t>
+      </w:r>
+    </w:p>
+    <w:p>
+      <w:r>
+        <w:rPr>
+          <w:rFonts w:ascii="Consolas" w:hAnsi="Consolas"/>
+          <w:sz w:val="18"/>
+        </w:rPr>
+        <w:t>AMBIENTE=UAT https://avicola.globaldv.net (código SPEC 008 verificado 2026-10-18)</w:t>
+        <w:br/>
+        <w:t>DATASET=QA-DEMO-V1 PENDIENTE DE CARGA (ver §2.4: si no está cargado, crear datos manualmente)</w:t>
+        <w:br/>
+        <w:t>SHA=68d78fc (c436811)</w:t>
+        <w:br/>
+        <w:t>USUARIOS=qa.* pendientes de la carga del dataset (hoy solo existen usuarios de Progenitoras)</w:t>
+        <w:br/>
+        <w:t>SAP REAL=PENDIENTE</w:t>
+        <w:br/>
+        <w:t>FECHA SAP REAL=20-10-2026</w:t>
+        <w:br/>
+        <w:t>DECISIONES OWNER ABIERTAS=OD-QA2-01..05 + política de OC sin cadena</w:t>
+      </w:r>
+    </w:p>
+    <w:p>
+      <w:r>
+        <w:rPr>
+          <w:b/>
+          <w:i w:val="0"/>
+        </w:rPr>
+        <w:t>Qué puede probar</w:t>
+      </w:r>
+      <w:r>
+        <w:rPr>
+          <w:i w:val="0"/>
+        </w:rPr>
+        <w:t xml:space="preserve"> (con el código desplegado y los usuarios disponibles): Configuración, Usuarios, Roles,</w:t>
+      </w:r>
+    </w:p>
+    <w:p>
+      <w:r>
+        <w:rPr>
+          <w:i w:val="0"/>
+        </w:rPr>
+        <w:t>Acceso por Unidad, Reproductoras cría/producción, Incubadora, Historial, Mis pendientes, Revisión, Aprobaciones,</w:t>
+      </w:r>
+    </w:p>
+    <w:p>
+      <w:r>
+        <w:rPr>
+          <w:i w:val="0"/>
+        </w:rPr>
+        <w:t>Maestros, Cargas iniciales, Reportes y SAP UI con datos sintéticos.</w:t>
+      </w:r>
+    </w:p>
+    <w:p>
+      <w:r>
+        <w:rPr>
+          <w:b/>
+          <w:i w:val="0"/>
+        </w:rPr>
+        <w:t>Qué NO debe reportar como defecto por estar sujeto a decisión del Owner</w:t>
+      </w:r>
+      <w:r>
+        <w:rPr>
+          <w:i w:val="0"/>
+        </w:rPr>
+        <w:t>: unicidad de vacunas/medicamentos/causas</w:t>
+      </w:r>
+    </w:p>
+    <w:p>
+      <w:r>
+        <w:rPr>
+          <w:i w:val="0"/>
+        </w:rPr>
+        <w:t>(OD-QA2-01); zona en plantas (OD-QA2-02); autocompletado desde la OC (OD-QA2-03); orden de procesos no bloqueado por</w:t>
+      </w:r>
+    </w:p>
+    <w:p>
+      <w:r>
+        <w:rPr>
+          <w:i w:val="0"/>
+        </w:rPr>
+        <w:t>backend (OD-QA2-04); fechas futuras distintas de la del evento (OD-QA2-05); OC sin cadena permitida en recepción</w:t>
+      </w:r>
+    </w:p>
+    <w:p>
+      <w:r>
+        <w:rPr>
+          <w:i w:val="0"/>
+        </w:rPr>
+        <w:t>(</w:t>
+      </w:r>
+      <w:r>
+        <w:rPr>
+          <w:rFonts w:ascii="Consolas" w:hAnsi="Consolas"/>
+          <w:i w:val="0"/>
+          <w:sz w:val="18"/>
+        </w:rPr>
+        <w:t>UNKNOWN_CHAIN_OC=ALLOWED_CURRENTLY_OWNER_DECISION_PENDING</w:t>
+      </w:r>
+      <w:r>
+        <w:rPr>
+          <w:i w:val="0"/>
+        </w:rPr>
+        <w:t>).</w:t>
+      </w:r>
+    </w:p>
+    <w:p>
+      <w:r>
+        <w:rPr>
+          <w:i/>
+        </w:rPr>
+        <w:t>Los registros SAP visibles durante esta ronda son datos sintéticos de prueba. La conexión real con SAP HANA Cloud</w:t>
+      </w:r>
+    </w:p>
+    <w:p>
+      <w:r>
+        <w:rPr>
+          <w:i/>
+        </w:rPr>
+        <w:t>mediante usuario técnico READ ONLY será validada en una sesión independiente.</w:t>
       </w:r>
     </w:p>
     <w:p/>

</xml_diff>